<commit_message>
Stage 8 review fixes: HO-015
</commit_message>
<xml_diff>
--- a/output/archive/Tarnovell_Group/Brand/Guidelines/2020/Tarnovell_Brand_Guidelines_v1.docx
+++ b/output/archive/Tarnovell_Group/Brand/Guidelines/2020/Tarnovell_Brand_Guidelines_v1.docx
@@ -31,6 +31,11 @@
     </w:p>
     <w:p>
       <w:r>
+        <w:t>Tarnovell Bioscience Group</w:t>
+      </w:r>
+    </w:p>
+    <w:p>
+      <w:r>
         <w:t>Report no. TG-HO-BRD-2020-001</w:t>
       </w:r>
     </w:p>
@@ -59,7 +64,7 @@
           <w:i/>
           <w:sz w:val="18"/>
         </w:rPr>
-        <w:t>They apply from 1 March 2020. Group templates have been updated to match and the old group letterhead should no longer be used.</w:t>
+        <w:t>The Tarnovell identity applies from 1 January 2020. Use the common group master for new group material; local template transitions follow the firm-specific migration schedule.</w:t>
       </w:r>
     </w:p>
     <w:p>
@@ -73,7 +78,7 @@
     </w:p>
     <w:p>
       <w:r>
-        <w:t>The group name is written as Tarnovell Bioscience Group in full on first use in any document. The short form Tarnovell is acceptable thereafter. The brand line is Tarnovell Bioscience Group and is not translated, abbreviated or combined with a firm name on the same line.</w:t>
+        <w:t>The group name is written as Tarnovell Bioscience Group in full on first use. The short form Tarnovell is acceptable thereafter. Head-office material uses the brand line Tarnovell Bioscience Group; subsidiary material uses the approved firm-specific line in section 7.</w:t>
       </w:r>
     </w:p>
     <w:p>
@@ -554,7 +559,7 @@
     </w:p>
     <w:p>
       <w:r>
-        <w:t>Each subsidiary may use its own name in its own material, with the group brand line placed beneath it. The approved combinations are listed below. No other combinations are approved for use in 2020.</w:t>
+        <w:t>Each subsidiary retains its legal name and uses the approved line below on new covers, title slides and workbook summary sheets from the start of its group identity. Local project and accession numbers remain unchanged.</w:t>
       </w:r>
     </w:p>
     <w:p>
@@ -615,7 +620,7 @@
                 <w:color w:val="FFFFFF"/>
                 <w:sz w:val="18"/>
               </w:rPr>
-              <w:t>Name on material</w:t>
+              <w:t>Legal name</w:t>
             </w:r>
           </w:p>
         </w:tc>
@@ -634,7 +639,7 @@
                 <w:color w:val="FFFFFF"/>
                 <w:sz w:val="18"/>
               </w:rPr>
-              <w:t>Brand line beneath</w:t>
+              <w:t>Approved brand line</w:t>
             </w:r>
           </w:p>
         </w:tc>
@@ -684,7 +689,7 @@
               <w:rPr>
                 <w:sz w:val="18"/>
               </w:rPr>
-              <w:t>Tarnovell Bioscience Group</w:t>
+              <w:t>Vellacombe Discovery Ltd, a Tarnovell company</w:t>
             </w:r>
           </w:p>
         </w:tc>
@@ -734,7 +739,7 @@
               <w:rPr>
                 <w:sz w:val="18"/>
               </w:rPr>
-              <w:t>Tarnovell Bioscience Group</w:t>
+              <w:t>Brindlewythe Biosciences Ltd, a Tarnovell company</w:t>
             </w:r>
           </w:p>
         </w:tc>
@@ -784,7 +789,7 @@
               <w:rPr>
                 <w:sz w:val="18"/>
               </w:rPr>
-              <w:t>Tarnovell Bioscience Group</w:t>
+              <w:t>Merrivoss Bioanalysis Inc, a Tarnovell company</w:t>
             </w:r>
           </w:p>
         </w:tc>
@@ -834,7 +839,7 @@
               <w:rPr>
                 <w:sz w:val="18"/>
               </w:rPr>
-              <w:t>Tarnovell Bioscience Group</w:t>
+              <w:t>Quenverell Computational Ltd, a Tarnovell company</w:t>
             </w:r>
           </w:p>
         </w:tc>
@@ -875,7 +880,7 @@
               <w:rPr>
                 <w:sz w:val="18"/>
               </w:rPr>
-              <w:t>Tarnovell Bioscience Group</w:t>
+              <w:t>Westravelle Analytical Ltd, a Tarnovell company</w:t>
             </w:r>
           </w:p>
         </w:tc>
@@ -888,7 +893,7 @@
           <w:i/>
           <w:sz w:val="18"/>
         </w:rPr>
-        <w:t>Scientific leadership stays with each firm. The subsidiary name on a study report is the name of the performing laboratory, and the study director named on the report is the person who signs it.</w:t>
+        <w:t>Scientific leadership stays with each firm. The performing laboratory remains identified on scientific reports, with review and signature responsibilities determined by its local quality system.</w:t>
       </w:r>
     </w:p>
     <w:p>
@@ -902,7 +907,7 @@
     </w:p>
     <w:p>
       <w:r>
-        <w:t>Records created before the launch keep their original appearance. They are not restyled, re-headed or re-footed when they are copied, moved or re-issued, unless the owning firm asks for a reissue in the group template with a note that the content is unchanged.</w:t>
+        <w:t>Historical records keep their original appearance. They are not restyled, re-headed or re-footed when copied or moved. A new document derived from an archived record must remain distinguishable from the preserved original.</w:t>
       </w:r>
     </w:p>
     <w:p>
@@ -910,7 +915,7 @@
         <w:rPr>
           <w:b/>
         </w:rPr>
-        <w:t>Client-facing reports issued before February 2020 keep the logo, colours and footer of the firm that issued them. Do not alter the document to bring it into line with these guidelines.</w:t>
+        <w:t>Reports issued before the relevant firm’s group identity began keep their original logo, colours and footer. Do not alter archived records to match these guidelines.</w:t>
       </w:r>
     </w:p>
     <w:p>

</xml_diff>